<commit_message>
added edit attendance function
</commit_message>
<xml_diff>
--- a/backend/dtr/template/dtr-temp.docx
+++ b/backend/dtr/template/dtr-temp.docx
@@ -968,7 +968,7 @@
               <w:top w:val="single" w:color="auto" w:sz="12" w:space="0"/>
               <w:left w:val="single" w:color="auto" w:sz="12" w:space="0"/>
             </w:tcBorders>
-            <w:shd w:val="clear"/>
+            <w:shd w:val="clear" w:color="auto" w:fill="auto"/>
             <w:vAlign w:val="top"/>
           </w:tcPr>
           <w:p>
@@ -998,7 +998,7 @@
               <w:top w:val="single" w:color="auto" w:sz="12" w:space="0"/>
               <w:right w:val="single" w:color="auto" w:sz="12" w:space="0"/>
             </w:tcBorders>
-            <w:shd w:val="clear"/>
+            <w:shd w:val="clear" w:color="auto" w:fill="auto"/>
             <w:vAlign w:val="top"/>
           </w:tcPr>
           <w:p>
@@ -1187,7 +1187,7 @@
             <w:tcBorders>
               <w:left w:val="single" w:color="auto" w:sz="12" w:space="0"/>
             </w:tcBorders>
-            <w:shd w:val="clear"/>
+            <w:shd w:val="clear" w:color="auto" w:fill="auto"/>
             <w:vAlign w:val="top"/>
           </w:tcPr>
           <w:p>
@@ -1216,7 +1216,7 @@
             <w:tcBorders>
               <w:right w:val="single" w:color="auto" w:sz="12" w:space="0"/>
             </w:tcBorders>
-            <w:shd w:val="clear"/>
+            <w:shd w:val="clear" w:color="auto" w:fill="auto"/>
             <w:vAlign w:val="top"/>
           </w:tcPr>
           <w:p>
@@ -1404,7 +1404,7 @@
             <w:tcBorders>
               <w:left w:val="single" w:color="auto" w:sz="12" w:space="0"/>
             </w:tcBorders>
-            <w:shd w:val="clear"/>
+            <w:shd w:val="clear" w:color="auto" w:fill="auto"/>
             <w:vAlign w:val="top"/>
           </w:tcPr>
           <w:p>
@@ -1433,7 +1433,7 @@
             <w:tcBorders>
               <w:right w:val="single" w:color="auto" w:sz="12" w:space="0"/>
             </w:tcBorders>
-            <w:shd w:val="clear"/>
+            <w:shd w:val="clear" w:color="auto" w:fill="auto"/>
             <w:vAlign w:val="top"/>
           </w:tcPr>
           <w:p>
@@ -1620,7 +1620,7 @@
             <w:tcBorders>
               <w:left w:val="single" w:color="auto" w:sz="12" w:space="0"/>
             </w:tcBorders>
-            <w:shd w:val="clear"/>
+            <w:shd w:val="clear" w:color="auto" w:fill="auto"/>
             <w:vAlign w:val="top"/>
           </w:tcPr>
           <w:p>
@@ -1649,7 +1649,7 @@
             <w:tcBorders>
               <w:right w:val="single" w:color="auto" w:sz="12" w:space="0"/>
             </w:tcBorders>
-            <w:shd w:val="clear"/>
+            <w:shd w:val="clear" w:color="auto" w:fill="auto"/>
             <w:vAlign w:val="top"/>
           </w:tcPr>
           <w:p>
@@ -1836,7 +1836,7 @@
             <w:tcBorders>
               <w:left w:val="single" w:color="auto" w:sz="12" w:space="0"/>
             </w:tcBorders>
-            <w:shd w:val="clear"/>
+            <w:shd w:val="clear" w:color="auto" w:fill="auto"/>
             <w:vAlign w:val="top"/>
           </w:tcPr>
           <w:p>
@@ -1865,7 +1865,7 @@
             <w:tcBorders>
               <w:right w:val="single" w:color="auto" w:sz="12" w:space="0"/>
             </w:tcBorders>
-            <w:shd w:val="clear"/>
+            <w:shd w:val="clear" w:color="auto" w:fill="auto"/>
             <w:vAlign w:val="top"/>
           </w:tcPr>
           <w:p>
@@ -2052,7 +2052,7 @@
             <w:tcBorders>
               <w:left w:val="single" w:color="auto" w:sz="12" w:space="0"/>
             </w:tcBorders>
-            <w:shd w:val="clear"/>
+            <w:shd w:val="clear" w:color="auto" w:fill="auto"/>
             <w:vAlign w:val="top"/>
           </w:tcPr>
           <w:p>
@@ -2081,7 +2081,7 @@
             <w:tcBorders>
               <w:right w:val="single" w:color="auto" w:sz="12" w:space="0"/>
             </w:tcBorders>
-            <w:shd w:val="clear"/>
+            <w:shd w:val="clear" w:color="auto" w:fill="auto"/>
             <w:vAlign w:val="top"/>
           </w:tcPr>
           <w:p>
@@ -2268,7 +2268,7 @@
             <w:tcBorders>
               <w:left w:val="single" w:color="auto" w:sz="12" w:space="0"/>
             </w:tcBorders>
-            <w:shd w:val="clear"/>
+            <w:shd w:val="clear" w:color="auto" w:fill="auto"/>
             <w:vAlign w:val="top"/>
           </w:tcPr>
           <w:p>
@@ -2297,7 +2297,7 @@
             <w:tcBorders>
               <w:right w:val="single" w:color="auto" w:sz="12" w:space="0"/>
             </w:tcBorders>
-            <w:shd w:val="clear"/>
+            <w:shd w:val="clear" w:color="auto" w:fill="auto"/>
             <w:vAlign w:val="top"/>
           </w:tcPr>
           <w:p>
@@ -2484,7 +2484,7 @@
             <w:tcBorders>
               <w:left w:val="single" w:color="auto" w:sz="12" w:space="0"/>
             </w:tcBorders>
-            <w:shd w:val="clear"/>
+            <w:shd w:val="clear" w:color="auto" w:fill="auto"/>
             <w:vAlign w:val="top"/>
           </w:tcPr>
           <w:p>
@@ -2513,7 +2513,7 @@
             <w:tcBorders>
               <w:right w:val="single" w:color="auto" w:sz="12" w:space="0"/>
             </w:tcBorders>
-            <w:shd w:val="clear"/>
+            <w:shd w:val="clear" w:color="auto" w:fill="auto"/>
             <w:vAlign w:val="top"/>
           </w:tcPr>
           <w:p>
@@ -2700,7 +2700,7 @@
             <w:tcBorders>
               <w:left w:val="single" w:color="auto" w:sz="12" w:space="0"/>
             </w:tcBorders>
-            <w:shd w:val="clear"/>
+            <w:shd w:val="clear" w:color="auto" w:fill="auto"/>
             <w:vAlign w:val="top"/>
           </w:tcPr>
           <w:p>
@@ -2729,7 +2729,7 @@
             <w:tcBorders>
               <w:right w:val="single" w:color="auto" w:sz="12" w:space="0"/>
             </w:tcBorders>
-            <w:shd w:val="clear"/>
+            <w:shd w:val="clear" w:color="auto" w:fill="auto"/>
             <w:vAlign w:val="top"/>
           </w:tcPr>
           <w:p>
@@ -2916,7 +2916,7 @@
             <w:tcBorders>
               <w:left w:val="single" w:color="auto" w:sz="12" w:space="0"/>
             </w:tcBorders>
-            <w:shd w:val="clear"/>
+            <w:shd w:val="clear" w:color="auto" w:fill="auto"/>
             <w:vAlign w:val="top"/>
           </w:tcPr>
           <w:p>
@@ -2945,7 +2945,7 @@
             <w:tcBorders>
               <w:right w:val="single" w:color="auto" w:sz="12" w:space="0"/>
             </w:tcBorders>
-            <w:shd w:val="clear"/>
+            <w:shd w:val="clear" w:color="auto" w:fill="auto"/>
             <w:vAlign w:val="top"/>
           </w:tcPr>
           <w:p>
@@ -3132,7 +3132,7 @@
             <w:tcBorders>
               <w:left w:val="single" w:color="auto" w:sz="12" w:space="0"/>
             </w:tcBorders>
-            <w:shd w:val="clear"/>
+            <w:shd w:val="clear" w:color="auto" w:fill="auto"/>
             <w:vAlign w:val="top"/>
           </w:tcPr>
           <w:p>
@@ -3161,7 +3161,7 @@
             <w:tcBorders>
               <w:right w:val="single" w:color="auto" w:sz="12" w:space="0"/>
             </w:tcBorders>
-            <w:shd w:val="clear"/>
+            <w:shd w:val="clear" w:color="auto" w:fill="auto"/>
             <w:vAlign w:val="top"/>
           </w:tcPr>
           <w:p>
@@ -3348,7 +3348,7 @@
             <w:tcBorders>
               <w:left w:val="single" w:color="auto" w:sz="12" w:space="0"/>
             </w:tcBorders>
-            <w:shd w:val="clear"/>
+            <w:shd w:val="clear" w:color="auto" w:fill="auto"/>
             <w:vAlign w:val="top"/>
           </w:tcPr>
           <w:p>
@@ -3377,7 +3377,7 @@
             <w:tcBorders>
               <w:right w:val="single" w:color="auto" w:sz="12" w:space="0"/>
             </w:tcBorders>
-            <w:shd w:val="clear"/>
+            <w:shd w:val="clear" w:color="auto" w:fill="auto"/>
             <w:vAlign w:val="top"/>
           </w:tcPr>
           <w:p>
@@ -3564,7 +3564,7 @@
             <w:tcBorders>
               <w:left w:val="single" w:color="auto" w:sz="12" w:space="0"/>
             </w:tcBorders>
-            <w:shd w:val="clear"/>
+            <w:shd w:val="clear" w:color="auto" w:fill="auto"/>
             <w:vAlign w:val="top"/>
           </w:tcPr>
           <w:p>
@@ -3593,7 +3593,7 @@
             <w:tcBorders>
               <w:right w:val="single" w:color="auto" w:sz="12" w:space="0"/>
             </w:tcBorders>
-            <w:shd w:val="clear"/>
+            <w:shd w:val="clear" w:color="auto" w:fill="auto"/>
             <w:vAlign w:val="top"/>
           </w:tcPr>
           <w:p>
@@ -3780,7 +3780,7 @@
             <w:tcBorders>
               <w:left w:val="single" w:color="auto" w:sz="12" w:space="0"/>
             </w:tcBorders>
-            <w:shd w:val="clear"/>
+            <w:shd w:val="clear" w:color="auto" w:fill="auto"/>
             <w:vAlign w:val="top"/>
           </w:tcPr>
           <w:p>
@@ -3809,7 +3809,7 @@
             <w:tcBorders>
               <w:right w:val="single" w:color="auto" w:sz="12" w:space="0"/>
             </w:tcBorders>
-            <w:shd w:val="clear"/>
+            <w:shd w:val="clear" w:color="auto" w:fill="auto"/>
             <w:vAlign w:val="top"/>
           </w:tcPr>
           <w:p>
@@ -3996,7 +3996,7 @@
             <w:tcBorders>
               <w:left w:val="single" w:color="auto" w:sz="12" w:space="0"/>
             </w:tcBorders>
-            <w:shd w:val="clear"/>
+            <w:shd w:val="clear" w:color="auto" w:fill="auto"/>
             <w:vAlign w:val="top"/>
           </w:tcPr>
           <w:p>
@@ -4025,7 +4025,7 @@
             <w:tcBorders>
               <w:right w:val="single" w:color="auto" w:sz="12" w:space="0"/>
             </w:tcBorders>
-            <w:shd w:val="clear"/>
+            <w:shd w:val="clear" w:color="auto" w:fill="auto"/>
             <w:vAlign w:val="top"/>
           </w:tcPr>
           <w:p>
@@ -4212,7 +4212,7 @@
             <w:tcBorders>
               <w:left w:val="single" w:color="auto" w:sz="12" w:space="0"/>
             </w:tcBorders>
-            <w:shd w:val="clear"/>
+            <w:shd w:val="clear" w:color="auto" w:fill="auto"/>
             <w:vAlign w:val="top"/>
           </w:tcPr>
           <w:p>
@@ -4241,7 +4241,7 @@
             <w:tcBorders>
               <w:right w:val="single" w:color="auto" w:sz="12" w:space="0"/>
             </w:tcBorders>
-            <w:shd w:val="clear"/>
+            <w:shd w:val="clear" w:color="auto" w:fill="auto"/>
             <w:vAlign w:val="top"/>
           </w:tcPr>
           <w:p>
@@ -4428,7 +4428,7 @@
             <w:tcBorders>
               <w:left w:val="single" w:color="auto" w:sz="12" w:space="0"/>
             </w:tcBorders>
-            <w:shd w:val="clear"/>
+            <w:shd w:val="clear" w:color="auto" w:fill="auto"/>
             <w:vAlign w:val="top"/>
           </w:tcPr>
           <w:p>
@@ -4457,7 +4457,7 @@
             <w:tcBorders>
               <w:right w:val="single" w:color="auto" w:sz="12" w:space="0"/>
             </w:tcBorders>
-            <w:shd w:val="clear"/>
+            <w:shd w:val="clear" w:color="auto" w:fill="auto"/>
             <w:vAlign w:val="top"/>
           </w:tcPr>
           <w:p>
@@ -4644,7 +4644,7 @@
             <w:tcBorders>
               <w:left w:val="single" w:color="auto" w:sz="12" w:space="0"/>
             </w:tcBorders>
-            <w:shd w:val="clear"/>
+            <w:shd w:val="clear" w:color="auto" w:fill="auto"/>
             <w:vAlign w:val="top"/>
           </w:tcPr>
           <w:p>
@@ -4673,7 +4673,7 @@
             <w:tcBorders>
               <w:right w:val="single" w:color="auto" w:sz="12" w:space="0"/>
             </w:tcBorders>
-            <w:shd w:val="clear"/>
+            <w:shd w:val="clear" w:color="auto" w:fill="auto"/>
             <w:vAlign w:val="top"/>
           </w:tcPr>
           <w:p>
@@ -4860,7 +4860,7 @@
             <w:tcBorders>
               <w:left w:val="single" w:color="auto" w:sz="12" w:space="0"/>
             </w:tcBorders>
-            <w:shd w:val="clear"/>
+            <w:shd w:val="clear" w:color="auto" w:fill="auto"/>
             <w:vAlign w:val="top"/>
           </w:tcPr>
           <w:p>
@@ -4889,7 +4889,7 @@
             <w:tcBorders>
               <w:right w:val="single" w:color="auto" w:sz="12" w:space="0"/>
             </w:tcBorders>
-            <w:shd w:val="clear"/>
+            <w:shd w:val="clear" w:color="auto" w:fill="auto"/>
             <w:vAlign w:val="top"/>
           </w:tcPr>
           <w:p>
@@ -5076,7 +5076,7 @@
             <w:tcBorders>
               <w:left w:val="single" w:color="auto" w:sz="12" w:space="0"/>
             </w:tcBorders>
-            <w:shd w:val="clear"/>
+            <w:shd w:val="clear" w:color="auto" w:fill="auto"/>
             <w:vAlign w:val="top"/>
           </w:tcPr>
           <w:p>
@@ -5105,7 +5105,7 @@
             <w:tcBorders>
               <w:right w:val="single" w:color="auto" w:sz="12" w:space="0"/>
             </w:tcBorders>
-            <w:shd w:val="clear"/>
+            <w:shd w:val="clear" w:color="auto" w:fill="auto"/>
             <w:vAlign w:val="top"/>
           </w:tcPr>
           <w:p>
@@ -5292,7 +5292,7 @@
             <w:tcBorders>
               <w:left w:val="single" w:color="auto" w:sz="12" w:space="0"/>
             </w:tcBorders>
-            <w:shd w:val="clear"/>
+            <w:shd w:val="clear" w:color="auto" w:fill="auto"/>
             <w:vAlign w:val="top"/>
           </w:tcPr>
           <w:p>
@@ -5321,7 +5321,7 @@
             <w:tcBorders>
               <w:right w:val="single" w:color="auto" w:sz="12" w:space="0"/>
             </w:tcBorders>
-            <w:shd w:val="clear"/>
+            <w:shd w:val="clear" w:color="auto" w:fill="auto"/>
             <w:vAlign w:val="top"/>
           </w:tcPr>
           <w:p>
@@ -5508,7 +5508,7 @@
             <w:tcBorders>
               <w:left w:val="single" w:color="auto" w:sz="12" w:space="0"/>
             </w:tcBorders>
-            <w:shd w:val="clear"/>
+            <w:shd w:val="clear" w:color="auto" w:fill="auto"/>
             <w:vAlign w:val="top"/>
           </w:tcPr>
           <w:p>
@@ -5537,7 +5537,7 @@
             <w:tcBorders>
               <w:right w:val="single" w:color="auto" w:sz="12" w:space="0"/>
             </w:tcBorders>
-            <w:shd w:val="clear"/>
+            <w:shd w:val="clear" w:color="auto" w:fill="auto"/>
             <w:vAlign w:val="top"/>
           </w:tcPr>
           <w:p>
@@ -5724,7 +5724,7 @@
             <w:tcBorders>
               <w:left w:val="single" w:color="auto" w:sz="12" w:space="0"/>
             </w:tcBorders>
-            <w:shd w:val="clear"/>
+            <w:shd w:val="clear" w:color="auto" w:fill="auto"/>
             <w:vAlign w:val="top"/>
           </w:tcPr>
           <w:p>
@@ -5753,7 +5753,7 @@
             <w:tcBorders>
               <w:right w:val="single" w:color="auto" w:sz="12" w:space="0"/>
             </w:tcBorders>
-            <w:shd w:val="clear"/>
+            <w:shd w:val="clear" w:color="auto" w:fill="auto"/>
             <w:vAlign w:val="top"/>
           </w:tcPr>
           <w:p>
@@ -5940,7 +5940,7 @@
             <w:tcBorders>
               <w:left w:val="single" w:color="auto" w:sz="12" w:space="0"/>
             </w:tcBorders>
-            <w:shd w:val="clear"/>
+            <w:shd w:val="clear" w:color="auto" w:fill="auto"/>
             <w:vAlign w:val="top"/>
           </w:tcPr>
           <w:p>
@@ -5969,7 +5969,7 @@
             <w:tcBorders>
               <w:right w:val="single" w:color="auto" w:sz="12" w:space="0"/>
             </w:tcBorders>
-            <w:shd w:val="clear"/>
+            <w:shd w:val="clear" w:color="auto" w:fill="auto"/>
             <w:vAlign w:val="top"/>
           </w:tcPr>
           <w:p>
@@ -6156,7 +6156,7 @@
             <w:tcBorders>
               <w:left w:val="single" w:color="auto" w:sz="12" w:space="0"/>
             </w:tcBorders>
-            <w:shd w:val="clear"/>
+            <w:shd w:val="clear" w:color="auto" w:fill="auto"/>
             <w:vAlign w:val="top"/>
           </w:tcPr>
           <w:p>
@@ -6185,7 +6185,7 @@
             <w:tcBorders>
               <w:right w:val="single" w:color="auto" w:sz="12" w:space="0"/>
             </w:tcBorders>
-            <w:shd w:val="clear"/>
+            <w:shd w:val="clear" w:color="auto" w:fill="auto"/>
             <w:vAlign w:val="top"/>
           </w:tcPr>
           <w:p>
@@ -6372,7 +6372,7 @@
             <w:tcBorders>
               <w:left w:val="single" w:color="auto" w:sz="12" w:space="0"/>
             </w:tcBorders>
-            <w:shd w:val="clear"/>
+            <w:shd w:val="clear" w:color="auto" w:fill="auto"/>
             <w:vAlign w:val="top"/>
           </w:tcPr>
           <w:p>
@@ -6401,7 +6401,7 @@
             <w:tcBorders>
               <w:right w:val="single" w:color="auto" w:sz="12" w:space="0"/>
             </w:tcBorders>
-            <w:shd w:val="clear"/>
+            <w:shd w:val="clear" w:color="auto" w:fill="auto"/>
             <w:vAlign w:val="top"/>
           </w:tcPr>
           <w:p>
@@ -6588,7 +6588,7 @@
             <w:tcBorders>
               <w:left w:val="single" w:color="auto" w:sz="12" w:space="0"/>
             </w:tcBorders>
-            <w:shd w:val="clear"/>
+            <w:shd w:val="clear" w:color="auto" w:fill="auto"/>
             <w:vAlign w:val="top"/>
           </w:tcPr>
           <w:p>
@@ -6617,7 +6617,7 @@
             <w:tcBorders>
               <w:right w:val="single" w:color="auto" w:sz="12" w:space="0"/>
             </w:tcBorders>
-            <w:shd w:val="clear"/>
+            <w:shd w:val="clear" w:color="auto" w:fill="auto"/>
             <w:vAlign w:val="top"/>
           </w:tcPr>
           <w:p>
@@ -6804,7 +6804,7 @@
             <w:tcBorders>
               <w:left w:val="single" w:color="auto" w:sz="12" w:space="0"/>
             </w:tcBorders>
-            <w:shd w:val="clear"/>
+            <w:shd w:val="clear" w:color="auto" w:fill="auto"/>
             <w:vAlign w:val="top"/>
           </w:tcPr>
           <w:p>
@@ -6833,7 +6833,7 @@
             <w:tcBorders>
               <w:right w:val="single" w:color="auto" w:sz="12" w:space="0"/>
             </w:tcBorders>
-            <w:shd w:val="clear"/>
+            <w:shd w:val="clear" w:color="auto" w:fill="auto"/>
             <w:vAlign w:val="top"/>
           </w:tcPr>
           <w:p>
@@ -7020,7 +7020,7 @@
             <w:tcBorders>
               <w:left w:val="single" w:color="auto" w:sz="12" w:space="0"/>
             </w:tcBorders>
-            <w:shd w:val="clear"/>
+            <w:shd w:val="clear" w:color="auto" w:fill="auto"/>
             <w:vAlign w:val="top"/>
           </w:tcPr>
           <w:p>
@@ -7049,7 +7049,7 @@
             <w:tcBorders>
               <w:right w:val="single" w:color="auto" w:sz="12" w:space="0"/>
             </w:tcBorders>
-            <w:shd w:val="clear"/>
+            <w:shd w:val="clear" w:color="auto" w:fill="auto"/>
             <w:vAlign w:val="top"/>
           </w:tcPr>
           <w:p>
@@ -7236,7 +7236,7 @@
             <w:tcBorders>
               <w:left w:val="single" w:color="auto" w:sz="12" w:space="0"/>
             </w:tcBorders>
-            <w:shd w:val="clear"/>
+            <w:shd w:val="clear" w:color="auto" w:fill="auto"/>
             <w:vAlign w:val="top"/>
           </w:tcPr>
           <w:p>
@@ -7265,7 +7265,7 @@
             <w:tcBorders>
               <w:right w:val="single" w:color="auto" w:sz="12" w:space="0"/>
             </w:tcBorders>
-            <w:shd w:val="clear"/>
+            <w:shd w:val="clear" w:color="auto" w:fill="auto"/>
             <w:vAlign w:val="top"/>
           </w:tcPr>
           <w:p>
@@ -7452,7 +7452,7 @@
             <w:tcBorders>
               <w:left w:val="single" w:color="auto" w:sz="12" w:space="0"/>
             </w:tcBorders>
-            <w:shd w:val="clear"/>
+            <w:shd w:val="clear" w:color="auto" w:fill="auto"/>
             <w:vAlign w:val="top"/>
           </w:tcPr>
           <w:p>
@@ -7481,7 +7481,7 @@
             <w:tcBorders>
               <w:right w:val="single" w:color="auto" w:sz="12" w:space="0"/>
             </w:tcBorders>
-            <w:shd w:val="clear"/>
+            <w:shd w:val="clear" w:color="auto" w:fill="auto"/>
             <w:vAlign w:val="top"/>
           </w:tcPr>
           <w:p>
@@ -7901,13 +7901,8 @@
           <w:sz w:val="14"/>
         </w:rPr>
       </w:pPr>
-    </w:p>
-    <w:p>
-      <w:pPr>
-        <w:rPr>
-          <w:sz w:val="14"/>
-        </w:rPr>
-      </w:pPr>
+      <w:bookmarkStart w:id="0" w:name="_GoBack"/>
+      <w:bookmarkEnd w:id="0"/>
     </w:p>
     <w:p>
       <w:pPr>
@@ -8161,12 +8156,6 @@
             <w:insideH w:val="single" w:color="auto" w:sz="4" w:space="0"/>
             <w:insideV w:val="single" w:color="auto" w:sz="4" w:space="0"/>
           </w:tblBorders>
-          <w:tblCellMar>
-            <w:top w:w="0" w:type="dxa"/>
-            <w:left w:w="108" w:type="dxa"/>
-            <w:bottom w:w="0" w:type="dxa"/>
-            <w:right w:w="108" w:type="dxa"/>
-          </w:tblCellMar>
         </w:tblPrEx>
         <w:tc>
           <w:tcPr>
@@ -8439,8 +8428,6 @@
                 <w:lang w:val="en-PH"/>
               </w:rPr>
             </w:pPr>
-            <w:bookmarkStart w:id="0" w:name="_GoBack"/>
-            <w:bookmarkEnd w:id="0"/>
           </w:p>
         </w:tc>
       </w:tr>
@@ -8902,7 +8889,7 @@
               <w:top w:val="single" w:color="auto" w:sz="12" w:space="0"/>
               <w:left w:val="single" w:color="auto" w:sz="12" w:space="0"/>
             </w:tcBorders>
-            <w:shd w:val="clear"/>
+            <w:shd w:val="clear" w:color="auto" w:fill="auto"/>
             <w:vAlign w:val="top"/>
           </w:tcPr>
           <w:p>
@@ -8932,7 +8919,7 @@
               <w:top w:val="single" w:color="auto" w:sz="12" w:space="0"/>
               <w:right w:val="single" w:color="auto" w:sz="12" w:space="0"/>
             </w:tcBorders>
-            <w:shd w:val="clear"/>
+            <w:shd w:val="clear" w:color="auto" w:fill="auto"/>
             <w:vAlign w:val="top"/>
           </w:tcPr>
           <w:p>
@@ -9024,7 +9011,7 @@
               <w:bottom w:val="single" w:color="auto" w:sz="2" w:space="0"/>
               <w:right w:val="single" w:color="auto" w:sz="2" w:space="0"/>
             </w:tcBorders>
-            <w:shd w:val="clear"/>
+            <w:shd w:val="clear" w:color="auto" w:fill="auto"/>
             <w:vAlign w:val="top"/>
           </w:tcPr>
           <w:p>
@@ -9057,7 +9044,7 @@
               <w:bottom w:val="single" w:color="auto" w:sz="2" w:space="0"/>
               <w:right w:val="single" w:color="auto" w:sz="2" w:space="0"/>
             </w:tcBorders>
-            <w:shd w:val="clear"/>
+            <w:shd w:val="clear" w:color="auto" w:fill="auto"/>
             <w:vAlign w:val="top"/>
           </w:tcPr>
           <w:p>
@@ -9133,7 +9120,7 @@
             <w:tcBorders>
               <w:left w:val="single" w:color="auto" w:sz="12" w:space="0"/>
             </w:tcBorders>
-            <w:shd w:val="clear"/>
+            <w:shd w:val="clear" w:color="auto" w:fill="auto"/>
             <w:vAlign w:val="top"/>
           </w:tcPr>
           <w:p>
@@ -9162,7 +9149,7 @@
             <w:tcBorders>
               <w:right w:val="single" w:color="auto" w:sz="12" w:space="0"/>
             </w:tcBorders>
-            <w:shd w:val="clear"/>
+            <w:shd w:val="clear" w:color="auto" w:fill="auto"/>
             <w:vAlign w:val="top"/>
           </w:tcPr>
           <w:p>
@@ -9252,7 +9239,7 @@
               <w:bottom w:val="single" w:color="auto" w:sz="2" w:space="0"/>
               <w:right w:val="single" w:color="auto" w:sz="2" w:space="0"/>
             </w:tcBorders>
-            <w:shd w:val="clear"/>
+            <w:shd w:val="clear" w:color="auto" w:fill="auto"/>
             <w:vAlign w:val="top"/>
           </w:tcPr>
           <w:p>
@@ -9285,7 +9272,7 @@
               <w:bottom w:val="single" w:color="auto" w:sz="2" w:space="0"/>
               <w:right w:val="single" w:color="auto" w:sz="2" w:space="0"/>
             </w:tcBorders>
-            <w:shd w:val="clear"/>
+            <w:shd w:val="clear" w:color="auto" w:fill="auto"/>
             <w:vAlign w:val="top"/>
           </w:tcPr>
           <w:p>
@@ -9361,7 +9348,7 @@
             <w:tcBorders>
               <w:left w:val="single" w:color="auto" w:sz="12" w:space="0"/>
             </w:tcBorders>
-            <w:shd w:val="clear"/>
+            <w:shd w:val="clear" w:color="auto" w:fill="auto"/>
             <w:vAlign w:val="top"/>
           </w:tcPr>
           <w:p>
@@ -9390,7 +9377,7 @@
             <w:tcBorders>
               <w:right w:val="single" w:color="auto" w:sz="12" w:space="0"/>
             </w:tcBorders>
-            <w:shd w:val="clear"/>
+            <w:shd w:val="clear" w:color="auto" w:fill="auto"/>
             <w:vAlign w:val="top"/>
           </w:tcPr>
           <w:p>
@@ -9480,7 +9467,7 @@
               <w:bottom w:val="single" w:color="auto" w:sz="2" w:space="0"/>
               <w:right w:val="single" w:color="auto" w:sz="2" w:space="0"/>
             </w:tcBorders>
-            <w:shd w:val="clear"/>
+            <w:shd w:val="clear" w:color="auto" w:fill="auto"/>
             <w:vAlign w:val="top"/>
           </w:tcPr>
           <w:p>
@@ -9513,7 +9500,7 @@
               <w:bottom w:val="single" w:color="auto" w:sz="2" w:space="0"/>
               <w:right w:val="single" w:color="auto" w:sz="2" w:space="0"/>
             </w:tcBorders>
-            <w:shd w:val="clear"/>
+            <w:shd w:val="clear" w:color="auto" w:fill="auto"/>
             <w:vAlign w:val="top"/>
           </w:tcPr>
           <w:p>
@@ -9589,7 +9576,7 @@
             <w:tcBorders>
               <w:left w:val="single" w:color="auto" w:sz="12" w:space="0"/>
             </w:tcBorders>
-            <w:shd w:val="clear"/>
+            <w:shd w:val="clear" w:color="auto" w:fill="auto"/>
             <w:vAlign w:val="top"/>
           </w:tcPr>
           <w:p>
@@ -9618,7 +9605,7 @@
             <w:tcBorders>
               <w:right w:val="single" w:color="auto" w:sz="12" w:space="0"/>
             </w:tcBorders>
-            <w:shd w:val="clear"/>
+            <w:shd w:val="clear" w:color="auto" w:fill="auto"/>
             <w:vAlign w:val="top"/>
           </w:tcPr>
           <w:p>
@@ -9708,7 +9695,7 @@
               <w:bottom w:val="single" w:color="auto" w:sz="2" w:space="0"/>
               <w:right w:val="single" w:color="auto" w:sz="2" w:space="0"/>
             </w:tcBorders>
-            <w:shd w:val="clear"/>
+            <w:shd w:val="clear" w:color="auto" w:fill="auto"/>
             <w:vAlign w:val="top"/>
           </w:tcPr>
           <w:p>
@@ -9741,7 +9728,7 @@
               <w:bottom w:val="single" w:color="auto" w:sz="2" w:space="0"/>
               <w:right w:val="single" w:color="auto" w:sz="2" w:space="0"/>
             </w:tcBorders>
-            <w:shd w:val="clear"/>
+            <w:shd w:val="clear" w:color="auto" w:fill="auto"/>
             <w:vAlign w:val="top"/>
           </w:tcPr>
           <w:p>
@@ -9817,7 +9804,7 @@
             <w:tcBorders>
               <w:left w:val="single" w:color="auto" w:sz="12" w:space="0"/>
             </w:tcBorders>
-            <w:shd w:val="clear"/>
+            <w:shd w:val="clear" w:color="auto" w:fill="auto"/>
             <w:vAlign w:val="top"/>
           </w:tcPr>
           <w:p>
@@ -9846,7 +9833,7 @@
             <w:tcBorders>
               <w:right w:val="single" w:color="auto" w:sz="12" w:space="0"/>
             </w:tcBorders>
-            <w:shd w:val="clear"/>
+            <w:shd w:val="clear" w:color="auto" w:fill="auto"/>
             <w:vAlign w:val="top"/>
           </w:tcPr>
           <w:p>
@@ -9936,7 +9923,7 @@
               <w:bottom w:val="single" w:color="auto" w:sz="2" w:space="0"/>
               <w:right w:val="single" w:color="auto" w:sz="2" w:space="0"/>
             </w:tcBorders>
-            <w:shd w:val="clear"/>
+            <w:shd w:val="clear" w:color="auto" w:fill="auto"/>
             <w:vAlign w:val="top"/>
           </w:tcPr>
           <w:p>
@@ -9969,7 +9956,7 @@
               <w:bottom w:val="single" w:color="auto" w:sz="2" w:space="0"/>
               <w:right w:val="single" w:color="auto" w:sz="2" w:space="0"/>
             </w:tcBorders>
-            <w:shd w:val="clear"/>
+            <w:shd w:val="clear" w:color="auto" w:fill="auto"/>
             <w:vAlign w:val="top"/>
           </w:tcPr>
           <w:p>
@@ -10045,7 +10032,7 @@
             <w:tcBorders>
               <w:left w:val="single" w:color="auto" w:sz="12" w:space="0"/>
             </w:tcBorders>
-            <w:shd w:val="clear"/>
+            <w:shd w:val="clear" w:color="auto" w:fill="auto"/>
             <w:vAlign w:val="top"/>
           </w:tcPr>
           <w:p>
@@ -10074,7 +10061,7 @@
             <w:tcBorders>
               <w:right w:val="single" w:color="auto" w:sz="12" w:space="0"/>
             </w:tcBorders>
-            <w:shd w:val="clear"/>
+            <w:shd w:val="clear" w:color="auto" w:fill="auto"/>
             <w:vAlign w:val="top"/>
           </w:tcPr>
           <w:p>
@@ -10164,7 +10151,7 @@
               <w:bottom w:val="single" w:color="auto" w:sz="2" w:space="0"/>
               <w:right w:val="single" w:color="auto" w:sz="2" w:space="0"/>
             </w:tcBorders>
-            <w:shd w:val="clear"/>
+            <w:shd w:val="clear" w:color="auto" w:fill="auto"/>
             <w:vAlign w:val="top"/>
           </w:tcPr>
           <w:p>
@@ -10197,7 +10184,7 @@
               <w:bottom w:val="single" w:color="auto" w:sz="2" w:space="0"/>
               <w:right w:val="single" w:color="auto" w:sz="2" w:space="0"/>
             </w:tcBorders>
-            <w:shd w:val="clear"/>
+            <w:shd w:val="clear" w:color="auto" w:fill="auto"/>
             <w:vAlign w:val="top"/>
           </w:tcPr>
           <w:p>
@@ -10273,7 +10260,7 @@
             <w:tcBorders>
               <w:left w:val="single" w:color="auto" w:sz="12" w:space="0"/>
             </w:tcBorders>
-            <w:shd w:val="clear"/>
+            <w:shd w:val="clear" w:color="auto" w:fill="auto"/>
             <w:vAlign w:val="top"/>
           </w:tcPr>
           <w:p>
@@ -10302,7 +10289,7 @@
             <w:tcBorders>
               <w:right w:val="single" w:color="auto" w:sz="12" w:space="0"/>
             </w:tcBorders>
-            <w:shd w:val="clear"/>
+            <w:shd w:val="clear" w:color="auto" w:fill="auto"/>
             <w:vAlign w:val="top"/>
           </w:tcPr>
           <w:p>
@@ -10392,7 +10379,7 @@
               <w:bottom w:val="single" w:color="auto" w:sz="2" w:space="0"/>
               <w:right w:val="single" w:color="auto" w:sz="2" w:space="0"/>
             </w:tcBorders>
-            <w:shd w:val="clear"/>
+            <w:shd w:val="clear" w:color="auto" w:fill="auto"/>
             <w:vAlign w:val="top"/>
           </w:tcPr>
           <w:p>
@@ -10425,7 +10412,7 @@
               <w:bottom w:val="single" w:color="auto" w:sz="2" w:space="0"/>
               <w:right w:val="single" w:color="auto" w:sz="2" w:space="0"/>
             </w:tcBorders>
-            <w:shd w:val="clear"/>
+            <w:shd w:val="clear" w:color="auto" w:fill="auto"/>
             <w:vAlign w:val="top"/>
           </w:tcPr>
           <w:p>
@@ -10501,7 +10488,7 @@
             <w:tcBorders>
               <w:left w:val="single" w:color="auto" w:sz="12" w:space="0"/>
             </w:tcBorders>
-            <w:shd w:val="clear"/>
+            <w:shd w:val="clear" w:color="auto" w:fill="auto"/>
             <w:vAlign w:val="top"/>
           </w:tcPr>
           <w:p>
@@ -10530,7 +10517,7 @@
             <w:tcBorders>
               <w:right w:val="single" w:color="auto" w:sz="12" w:space="0"/>
             </w:tcBorders>
-            <w:shd w:val="clear"/>
+            <w:shd w:val="clear" w:color="auto" w:fill="auto"/>
             <w:vAlign w:val="top"/>
           </w:tcPr>
           <w:p>
@@ -10620,7 +10607,7 @@
               <w:bottom w:val="single" w:color="auto" w:sz="2" w:space="0"/>
               <w:right w:val="single" w:color="auto" w:sz="2" w:space="0"/>
             </w:tcBorders>
-            <w:shd w:val="clear"/>
+            <w:shd w:val="clear" w:color="auto" w:fill="auto"/>
             <w:vAlign w:val="top"/>
           </w:tcPr>
           <w:p>
@@ -10653,7 +10640,7 @@
               <w:bottom w:val="single" w:color="auto" w:sz="2" w:space="0"/>
               <w:right w:val="single" w:color="auto" w:sz="2" w:space="0"/>
             </w:tcBorders>
-            <w:shd w:val="clear"/>
+            <w:shd w:val="clear" w:color="auto" w:fill="auto"/>
             <w:vAlign w:val="top"/>
           </w:tcPr>
           <w:p>
@@ -10729,7 +10716,7 @@
             <w:tcBorders>
               <w:left w:val="single" w:color="auto" w:sz="12" w:space="0"/>
             </w:tcBorders>
-            <w:shd w:val="clear"/>
+            <w:shd w:val="clear" w:color="auto" w:fill="auto"/>
             <w:vAlign w:val="top"/>
           </w:tcPr>
           <w:p>
@@ -10758,7 +10745,7 @@
             <w:tcBorders>
               <w:right w:val="single" w:color="auto" w:sz="12" w:space="0"/>
             </w:tcBorders>
-            <w:shd w:val="clear"/>
+            <w:shd w:val="clear" w:color="auto" w:fill="auto"/>
             <w:vAlign w:val="top"/>
           </w:tcPr>
           <w:p>
@@ -10848,7 +10835,7 @@
               <w:bottom w:val="single" w:color="auto" w:sz="2" w:space="0"/>
               <w:right w:val="single" w:color="auto" w:sz="2" w:space="0"/>
             </w:tcBorders>
-            <w:shd w:val="clear"/>
+            <w:shd w:val="clear" w:color="auto" w:fill="auto"/>
             <w:vAlign w:val="top"/>
           </w:tcPr>
           <w:p>
@@ -10881,7 +10868,7 @@
               <w:bottom w:val="single" w:color="auto" w:sz="2" w:space="0"/>
               <w:right w:val="single" w:color="auto" w:sz="2" w:space="0"/>
             </w:tcBorders>
-            <w:shd w:val="clear"/>
+            <w:shd w:val="clear" w:color="auto" w:fill="auto"/>
             <w:vAlign w:val="top"/>
           </w:tcPr>
           <w:p>
@@ -10957,7 +10944,7 @@
             <w:tcBorders>
               <w:left w:val="single" w:color="auto" w:sz="12" w:space="0"/>
             </w:tcBorders>
-            <w:shd w:val="clear"/>
+            <w:shd w:val="clear" w:color="auto" w:fill="auto"/>
             <w:vAlign w:val="top"/>
           </w:tcPr>
           <w:p>
@@ -10986,7 +10973,7 @@
             <w:tcBorders>
               <w:right w:val="single" w:color="auto" w:sz="12" w:space="0"/>
             </w:tcBorders>
-            <w:shd w:val="clear"/>
+            <w:shd w:val="clear" w:color="auto" w:fill="auto"/>
             <w:vAlign w:val="top"/>
           </w:tcPr>
           <w:p>
@@ -11076,7 +11063,7 @@
               <w:bottom w:val="single" w:color="auto" w:sz="2" w:space="0"/>
               <w:right w:val="single" w:color="auto" w:sz="2" w:space="0"/>
             </w:tcBorders>
-            <w:shd w:val="clear"/>
+            <w:shd w:val="clear" w:color="auto" w:fill="auto"/>
             <w:vAlign w:val="top"/>
           </w:tcPr>
           <w:p>
@@ -11109,7 +11096,7 @@
               <w:bottom w:val="single" w:color="auto" w:sz="2" w:space="0"/>
               <w:right w:val="single" w:color="auto" w:sz="2" w:space="0"/>
             </w:tcBorders>
-            <w:shd w:val="clear"/>
+            <w:shd w:val="clear" w:color="auto" w:fill="auto"/>
             <w:vAlign w:val="top"/>
           </w:tcPr>
           <w:p>
@@ -11185,7 +11172,7 @@
             <w:tcBorders>
               <w:left w:val="single" w:color="auto" w:sz="12" w:space="0"/>
             </w:tcBorders>
-            <w:shd w:val="clear"/>
+            <w:shd w:val="clear" w:color="auto" w:fill="auto"/>
             <w:vAlign w:val="top"/>
           </w:tcPr>
           <w:p>
@@ -11214,7 +11201,7 @@
             <w:tcBorders>
               <w:right w:val="single" w:color="auto" w:sz="12" w:space="0"/>
             </w:tcBorders>
-            <w:shd w:val="clear"/>
+            <w:shd w:val="clear" w:color="auto" w:fill="auto"/>
             <w:vAlign w:val="top"/>
           </w:tcPr>
           <w:p>
@@ -11304,7 +11291,7 @@
               <w:bottom w:val="single" w:color="auto" w:sz="2" w:space="0"/>
               <w:right w:val="single" w:color="auto" w:sz="2" w:space="0"/>
             </w:tcBorders>
-            <w:shd w:val="clear"/>
+            <w:shd w:val="clear" w:color="auto" w:fill="auto"/>
             <w:vAlign w:val="top"/>
           </w:tcPr>
           <w:p>
@@ -11337,7 +11324,7 @@
               <w:bottom w:val="single" w:color="auto" w:sz="2" w:space="0"/>
               <w:right w:val="single" w:color="auto" w:sz="2" w:space="0"/>
             </w:tcBorders>
-            <w:shd w:val="clear"/>
+            <w:shd w:val="clear" w:color="auto" w:fill="auto"/>
             <w:vAlign w:val="top"/>
           </w:tcPr>
           <w:p>
@@ -11413,7 +11400,7 @@
             <w:tcBorders>
               <w:left w:val="single" w:color="auto" w:sz="12" w:space="0"/>
             </w:tcBorders>
-            <w:shd w:val="clear"/>
+            <w:shd w:val="clear" w:color="auto" w:fill="auto"/>
             <w:vAlign w:val="top"/>
           </w:tcPr>
           <w:p>
@@ -11442,7 +11429,7 @@
             <w:tcBorders>
               <w:right w:val="single" w:color="auto" w:sz="12" w:space="0"/>
             </w:tcBorders>
-            <w:shd w:val="clear"/>
+            <w:shd w:val="clear" w:color="auto" w:fill="auto"/>
             <w:vAlign w:val="top"/>
           </w:tcPr>
           <w:p>
@@ -11532,7 +11519,7 @@
               <w:bottom w:val="single" w:color="auto" w:sz="2" w:space="0"/>
               <w:right w:val="single" w:color="auto" w:sz="2" w:space="0"/>
             </w:tcBorders>
-            <w:shd w:val="clear"/>
+            <w:shd w:val="clear" w:color="auto" w:fill="auto"/>
             <w:vAlign w:val="top"/>
           </w:tcPr>
           <w:p>
@@ -11565,7 +11552,7 @@
               <w:bottom w:val="single" w:color="auto" w:sz="2" w:space="0"/>
               <w:right w:val="single" w:color="auto" w:sz="2" w:space="0"/>
             </w:tcBorders>
-            <w:shd w:val="clear"/>
+            <w:shd w:val="clear" w:color="auto" w:fill="auto"/>
             <w:vAlign w:val="top"/>
           </w:tcPr>
           <w:p>
@@ -11641,7 +11628,7 @@
             <w:tcBorders>
               <w:left w:val="single" w:color="auto" w:sz="12" w:space="0"/>
             </w:tcBorders>
-            <w:shd w:val="clear"/>
+            <w:shd w:val="clear" w:color="auto" w:fill="auto"/>
             <w:vAlign w:val="top"/>
           </w:tcPr>
           <w:p>
@@ -11670,7 +11657,7 @@
             <w:tcBorders>
               <w:right w:val="single" w:color="auto" w:sz="12" w:space="0"/>
             </w:tcBorders>
-            <w:shd w:val="clear"/>
+            <w:shd w:val="clear" w:color="auto" w:fill="auto"/>
             <w:vAlign w:val="top"/>
           </w:tcPr>
           <w:p>
@@ -11760,7 +11747,7 @@
               <w:bottom w:val="single" w:color="auto" w:sz="2" w:space="0"/>
               <w:right w:val="single" w:color="auto" w:sz="2" w:space="0"/>
             </w:tcBorders>
-            <w:shd w:val="clear"/>
+            <w:shd w:val="clear" w:color="auto" w:fill="auto"/>
             <w:vAlign w:val="top"/>
           </w:tcPr>
           <w:p>
@@ -11793,7 +11780,7 @@
               <w:bottom w:val="single" w:color="auto" w:sz="2" w:space="0"/>
               <w:right w:val="single" w:color="auto" w:sz="2" w:space="0"/>
             </w:tcBorders>
-            <w:shd w:val="clear"/>
+            <w:shd w:val="clear" w:color="auto" w:fill="auto"/>
             <w:vAlign w:val="top"/>
           </w:tcPr>
           <w:p>
@@ -11869,7 +11856,7 @@
             <w:tcBorders>
               <w:left w:val="single" w:color="auto" w:sz="12" w:space="0"/>
             </w:tcBorders>
-            <w:shd w:val="clear"/>
+            <w:shd w:val="clear" w:color="auto" w:fill="auto"/>
             <w:vAlign w:val="top"/>
           </w:tcPr>
           <w:p>
@@ -11898,7 +11885,7 @@
             <w:tcBorders>
               <w:right w:val="single" w:color="auto" w:sz="12" w:space="0"/>
             </w:tcBorders>
-            <w:shd w:val="clear"/>
+            <w:shd w:val="clear" w:color="auto" w:fill="auto"/>
             <w:vAlign w:val="top"/>
           </w:tcPr>
           <w:p>
@@ -11988,7 +11975,7 @@
               <w:bottom w:val="single" w:color="auto" w:sz="2" w:space="0"/>
               <w:right w:val="single" w:color="auto" w:sz="2" w:space="0"/>
             </w:tcBorders>
-            <w:shd w:val="clear"/>
+            <w:shd w:val="clear" w:color="auto" w:fill="auto"/>
             <w:vAlign w:val="top"/>
           </w:tcPr>
           <w:p>
@@ -12021,7 +12008,7 @@
               <w:bottom w:val="single" w:color="auto" w:sz="2" w:space="0"/>
               <w:right w:val="single" w:color="auto" w:sz="2" w:space="0"/>
             </w:tcBorders>
-            <w:shd w:val="clear"/>
+            <w:shd w:val="clear" w:color="auto" w:fill="auto"/>
             <w:vAlign w:val="top"/>
           </w:tcPr>
           <w:p>
@@ -12097,7 +12084,7 @@
             <w:tcBorders>
               <w:left w:val="single" w:color="auto" w:sz="12" w:space="0"/>
             </w:tcBorders>
-            <w:shd w:val="clear"/>
+            <w:shd w:val="clear" w:color="auto" w:fill="auto"/>
             <w:vAlign w:val="top"/>
           </w:tcPr>
           <w:p>
@@ -12126,7 +12113,7 @@
             <w:tcBorders>
               <w:right w:val="single" w:color="auto" w:sz="12" w:space="0"/>
             </w:tcBorders>
-            <w:shd w:val="clear"/>
+            <w:shd w:val="clear" w:color="auto" w:fill="auto"/>
             <w:vAlign w:val="top"/>
           </w:tcPr>
           <w:p>
@@ -12216,7 +12203,7 @@
               <w:bottom w:val="single" w:color="auto" w:sz="2" w:space="0"/>
               <w:right w:val="single" w:color="auto" w:sz="2" w:space="0"/>
             </w:tcBorders>
-            <w:shd w:val="clear"/>
+            <w:shd w:val="clear" w:color="auto" w:fill="auto"/>
             <w:vAlign w:val="top"/>
           </w:tcPr>
           <w:p>
@@ -12249,7 +12236,7 @@
               <w:bottom w:val="single" w:color="auto" w:sz="2" w:space="0"/>
               <w:right w:val="single" w:color="auto" w:sz="2" w:space="0"/>
             </w:tcBorders>
-            <w:shd w:val="clear"/>
+            <w:shd w:val="clear" w:color="auto" w:fill="auto"/>
             <w:vAlign w:val="top"/>
           </w:tcPr>
           <w:p>
@@ -12325,7 +12312,7 @@
             <w:tcBorders>
               <w:left w:val="single" w:color="auto" w:sz="12" w:space="0"/>
             </w:tcBorders>
-            <w:shd w:val="clear"/>
+            <w:shd w:val="clear" w:color="auto" w:fill="auto"/>
             <w:vAlign w:val="top"/>
           </w:tcPr>
           <w:p>
@@ -12354,7 +12341,7 @@
             <w:tcBorders>
               <w:right w:val="single" w:color="auto" w:sz="12" w:space="0"/>
             </w:tcBorders>
-            <w:shd w:val="clear"/>
+            <w:shd w:val="clear" w:color="auto" w:fill="auto"/>
             <w:vAlign w:val="top"/>
           </w:tcPr>
           <w:p>
@@ -12444,7 +12431,7 @@
               <w:bottom w:val="single" w:color="auto" w:sz="2" w:space="0"/>
               <w:right w:val="single" w:color="auto" w:sz="2" w:space="0"/>
             </w:tcBorders>
-            <w:shd w:val="clear"/>
+            <w:shd w:val="clear" w:color="auto" w:fill="auto"/>
             <w:vAlign w:val="top"/>
           </w:tcPr>
           <w:p>
@@ -12477,7 +12464,7 @@
               <w:bottom w:val="single" w:color="auto" w:sz="2" w:space="0"/>
               <w:right w:val="single" w:color="auto" w:sz="2" w:space="0"/>
             </w:tcBorders>
-            <w:shd w:val="clear"/>
+            <w:shd w:val="clear" w:color="auto" w:fill="auto"/>
             <w:vAlign w:val="top"/>
           </w:tcPr>
           <w:p>
@@ -12553,7 +12540,7 @@
             <w:tcBorders>
               <w:left w:val="single" w:color="auto" w:sz="12" w:space="0"/>
             </w:tcBorders>
-            <w:shd w:val="clear"/>
+            <w:shd w:val="clear" w:color="auto" w:fill="auto"/>
             <w:vAlign w:val="top"/>
           </w:tcPr>
           <w:p>
@@ -12582,7 +12569,7 @@
             <w:tcBorders>
               <w:right w:val="single" w:color="auto" w:sz="12" w:space="0"/>
             </w:tcBorders>
-            <w:shd w:val="clear"/>
+            <w:shd w:val="clear" w:color="auto" w:fill="auto"/>
             <w:vAlign w:val="top"/>
           </w:tcPr>
           <w:p>
@@ -12672,7 +12659,7 @@
               <w:bottom w:val="single" w:color="auto" w:sz="2" w:space="0"/>
               <w:right w:val="single" w:color="auto" w:sz="2" w:space="0"/>
             </w:tcBorders>
-            <w:shd w:val="clear"/>
+            <w:shd w:val="clear" w:color="auto" w:fill="auto"/>
             <w:vAlign w:val="top"/>
           </w:tcPr>
           <w:p>
@@ -12705,7 +12692,7 @@
               <w:bottom w:val="single" w:color="auto" w:sz="2" w:space="0"/>
               <w:right w:val="single" w:color="auto" w:sz="2" w:space="0"/>
             </w:tcBorders>
-            <w:shd w:val="clear"/>
+            <w:shd w:val="clear" w:color="auto" w:fill="auto"/>
             <w:vAlign w:val="top"/>
           </w:tcPr>
           <w:p>
@@ -12781,7 +12768,7 @@
             <w:tcBorders>
               <w:left w:val="single" w:color="auto" w:sz="12" w:space="0"/>
             </w:tcBorders>
-            <w:shd w:val="clear"/>
+            <w:shd w:val="clear" w:color="auto" w:fill="auto"/>
             <w:vAlign w:val="top"/>
           </w:tcPr>
           <w:p>
@@ -12810,7 +12797,7 @@
             <w:tcBorders>
               <w:right w:val="single" w:color="auto" w:sz="12" w:space="0"/>
             </w:tcBorders>
-            <w:shd w:val="clear"/>
+            <w:shd w:val="clear" w:color="auto" w:fill="auto"/>
             <w:vAlign w:val="top"/>
           </w:tcPr>
           <w:p>
@@ -12900,7 +12887,7 @@
               <w:bottom w:val="single" w:color="auto" w:sz="2" w:space="0"/>
               <w:right w:val="single" w:color="auto" w:sz="2" w:space="0"/>
             </w:tcBorders>
-            <w:shd w:val="clear"/>
+            <w:shd w:val="clear" w:color="auto" w:fill="auto"/>
             <w:vAlign w:val="top"/>
           </w:tcPr>
           <w:p>
@@ -12933,7 +12920,7 @@
               <w:bottom w:val="single" w:color="auto" w:sz="2" w:space="0"/>
               <w:right w:val="single" w:color="auto" w:sz="2" w:space="0"/>
             </w:tcBorders>
-            <w:shd w:val="clear"/>
+            <w:shd w:val="clear" w:color="auto" w:fill="auto"/>
             <w:vAlign w:val="top"/>
           </w:tcPr>
           <w:p>
@@ -13009,7 +12996,7 @@
             <w:tcBorders>
               <w:left w:val="single" w:color="auto" w:sz="12" w:space="0"/>
             </w:tcBorders>
-            <w:shd w:val="clear"/>
+            <w:shd w:val="clear" w:color="auto" w:fill="auto"/>
             <w:vAlign w:val="top"/>
           </w:tcPr>
           <w:p>
@@ -13038,7 +13025,7 @@
             <w:tcBorders>
               <w:right w:val="single" w:color="auto" w:sz="12" w:space="0"/>
             </w:tcBorders>
-            <w:shd w:val="clear"/>
+            <w:shd w:val="clear" w:color="auto" w:fill="auto"/>
             <w:vAlign w:val="top"/>
           </w:tcPr>
           <w:p>
@@ -13128,7 +13115,7 @@
               <w:bottom w:val="single" w:color="auto" w:sz="2" w:space="0"/>
               <w:right w:val="single" w:color="auto" w:sz="2" w:space="0"/>
             </w:tcBorders>
-            <w:shd w:val="clear"/>
+            <w:shd w:val="clear" w:color="auto" w:fill="auto"/>
             <w:vAlign w:val="top"/>
           </w:tcPr>
           <w:p>
@@ -13161,7 +13148,7 @@
               <w:bottom w:val="single" w:color="auto" w:sz="2" w:space="0"/>
               <w:right w:val="single" w:color="auto" w:sz="2" w:space="0"/>
             </w:tcBorders>
-            <w:shd w:val="clear"/>
+            <w:shd w:val="clear" w:color="auto" w:fill="auto"/>
             <w:vAlign w:val="top"/>
           </w:tcPr>
           <w:p>
@@ -13237,7 +13224,7 @@
             <w:tcBorders>
               <w:left w:val="single" w:color="auto" w:sz="12" w:space="0"/>
             </w:tcBorders>
-            <w:shd w:val="clear"/>
+            <w:shd w:val="clear" w:color="auto" w:fill="auto"/>
             <w:vAlign w:val="top"/>
           </w:tcPr>
           <w:p>
@@ -13266,7 +13253,7 @@
             <w:tcBorders>
               <w:right w:val="single" w:color="auto" w:sz="12" w:space="0"/>
             </w:tcBorders>
-            <w:shd w:val="clear"/>
+            <w:shd w:val="clear" w:color="auto" w:fill="auto"/>
             <w:vAlign w:val="top"/>
           </w:tcPr>
           <w:p>
@@ -13356,7 +13343,7 @@
               <w:bottom w:val="single" w:color="auto" w:sz="2" w:space="0"/>
               <w:right w:val="single" w:color="auto" w:sz="2" w:space="0"/>
             </w:tcBorders>
-            <w:shd w:val="clear"/>
+            <w:shd w:val="clear" w:color="auto" w:fill="auto"/>
             <w:vAlign w:val="top"/>
           </w:tcPr>
           <w:p>
@@ -13389,7 +13376,7 @@
               <w:bottom w:val="single" w:color="auto" w:sz="2" w:space="0"/>
               <w:right w:val="single" w:color="auto" w:sz="2" w:space="0"/>
             </w:tcBorders>
-            <w:shd w:val="clear"/>
+            <w:shd w:val="clear" w:color="auto" w:fill="auto"/>
             <w:vAlign w:val="top"/>
           </w:tcPr>
           <w:p>
@@ -13465,7 +13452,7 @@
             <w:tcBorders>
               <w:left w:val="single" w:color="auto" w:sz="12" w:space="0"/>
             </w:tcBorders>
-            <w:shd w:val="clear"/>
+            <w:shd w:val="clear" w:color="auto" w:fill="auto"/>
             <w:vAlign w:val="top"/>
           </w:tcPr>
           <w:p>
@@ -13494,7 +13481,7 @@
             <w:tcBorders>
               <w:right w:val="single" w:color="auto" w:sz="12" w:space="0"/>
             </w:tcBorders>
-            <w:shd w:val="clear"/>
+            <w:shd w:val="clear" w:color="auto" w:fill="auto"/>
             <w:vAlign w:val="top"/>
           </w:tcPr>
           <w:p>
@@ -13584,7 +13571,7 @@
               <w:bottom w:val="single" w:color="auto" w:sz="2" w:space="0"/>
               <w:right w:val="single" w:color="auto" w:sz="2" w:space="0"/>
             </w:tcBorders>
-            <w:shd w:val="clear"/>
+            <w:shd w:val="clear" w:color="auto" w:fill="auto"/>
             <w:vAlign w:val="top"/>
           </w:tcPr>
           <w:p>
@@ -13617,7 +13604,7 @@
               <w:bottom w:val="single" w:color="auto" w:sz="2" w:space="0"/>
               <w:right w:val="single" w:color="auto" w:sz="2" w:space="0"/>
             </w:tcBorders>
-            <w:shd w:val="clear"/>
+            <w:shd w:val="clear" w:color="auto" w:fill="auto"/>
             <w:vAlign w:val="top"/>
           </w:tcPr>
           <w:p>
@@ -13693,7 +13680,7 @@
             <w:tcBorders>
               <w:left w:val="single" w:color="auto" w:sz="12" w:space="0"/>
             </w:tcBorders>
-            <w:shd w:val="clear"/>
+            <w:shd w:val="clear" w:color="auto" w:fill="auto"/>
             <w:vAlign w:val="top"/>
           </w:tcPr>
           <w:p>
@@ -13722,7 +13709,7 @@
             <w:tcBorders>
               <w:right w:val="single" w:color="auto" w:sz="12" w:space="0"/>
             </w:tcBorders>
-            <w:shd w:val="clear"/>
+            <w:shd w:val="clear" w:color="auto" w:fill="auto"/>
             <w:vAlign w:val="top"/>
           </w:tcPr>
           <w:p>
@@ -13812,7 +13799,7 @@
               <w:bottom w:val="single" w:color="auto" w:sz="2" w:space="0"/>
               <w:right w:val="single" w:color="auto" w:sz="2" w:space="0"/>
             </w:tcBorders>
-            <w:shd w:val="clear"/>
+            <w:shd w:val="clear" w:color="auto" w:fill="auto"/>
             <w:vAlign w:val="top"/>
           </w:tcPr>
           <w:p>
@@ -13845,7 +13832,7 @@
               <w:bottom w:val="single" w:color="auto" w:sz="2" w:space="0"/>
               <w:right w:val="single" w:color="auto" w:sz="2" w:space="0"/>
             </w:tcBorders>
-            <w:shd w:val="clear"/>
+            <w:shd w:val="clear" w:color="auto" w:fill="auto"/>
             <w:vAlign w:val="top"/>
           </w:tcPr>
           <w:p>
@@ -13921,7 +13908,7 @@
             <w:tcBorders>
               <w:left w:val="single" w:color="auto" w:sz="12" w:space="0"/>
             </w:tcBorders>
-            <w:shd w:val="clear"/>
+            <w:shd w:val="clear" w:color="auto" w:fill="auto"/>
             <w:vAlign w:val="top"/>
           </w:tcPr>
           <w:p>
@@ -13950,7 +13937,7 @@
             <w:tcBorders>
               <w:right w:val="single" w:color="auto" w:sz="12" w:space="0"/>
             </w:tcBorders>
-            <w:shd w:val="clear"/>
+            <w:shd w:val="clear" w:color="auto" w:fill="auto"/>
             <w:vAlign w:val="top"/>
           </w:tcPr>
           <w:p>
@@ -14040,7 +14027,7 @@
               <w:bottom w:val="single" w:color="auto" w:sz="2" w:space="0"/>
               <w:right w:val="single" w:color="auto" w:sz="2" w:space="0"/>
             </w:tcBorders>
-            <w:shd w:val="clear"/>
+            <w:shd w:val="clear" w:color="auto" w:fill="auto"/>
             <w:vAlign w:val="top"/>
           </w:tcPr>
           <w:p>
@@ -14073,7 +14060,7 @@
               <w:bottom w:val="single" w:color="auto" w:sz="2" w:space="0"/>
               <w:right w:val="single" w:color="auto" w:sz="2" w:space="0"/>
             </w:tcBorders>
-            <w:shd w:val="clear"/>
+            <w:shd w:val="clear" w:color="auto" w:fill="auto"/>
             <w:vAlign w:val="top"/>
           </w:tcPr>
           <w:p>
@@ -14149,7 +14136,7 @@
             <w:tcBorders>
               <w:left w:val="single" w:color="auto" w:sz="12" w:space="0"/>
             </w:tcBorders>
-            <w:shd w:val="clear"/>
+            <w:shd w:val="clear" w:color="auto" w:fill="auto"/>
             <w:vAlign w:val="top"/>
           </w:tcPr>
           <w:p>
@@ -14178,7 +14165,7 @@
             <w:tcBorders>
               <w:right w:val="single" w:color="auto" w:sz="12" w:space="0"/>
             </w:tcBorders>
-            <w:shd w:val="clear"/>
+            <w:shd w:val="clear" w:color="auto" w:fill="auto"/>
             <w:vAlign w:val="top"/>
           </w:tcPr>
           <w:p>
@@ -14268,7 +14255,7 @@
               <w:bottom w:val="single" w:color="auto" w:sz="2" w:space="0"/>
               <w:right w:val="single" w:color="auto" w:sz="2" w:space="0"/>
             </w:tcBorders>
-            <w:shd w:val="clear"/>
+            <w:shd w:val="clear" w:color="auto" w:fill="auto"/>
             <w:vAlign w:val="top"/>
           </w:tcPr>
           <w:p>
@@ -14301,7 +14288,7 @@
               <w:bottom w:val="single" w:color="auto" w:sz="2" w:space="0"/>
               <w:right w:val="single" w:color="auto" w:sz="2" w:space="0"/>
             </w:tcBorders>
-            <w:shd w:val="clear"/>
+            <w:shd w:val="clear" w:color="auto" w:fill="auto"/>
             <w:vAlign w:val="top"/>
           </w:tcPr>
           <w:p>
@@ -14377,7 +14364,7 @@
             <w:tcBorders>
               <w:left w:val="single" w:color="auto" w:sz="12" w:space="0"/>
             </w:tcBorders>
-            <w:shd w:val="clear"/>
+            <w:shd w:val="clear" w:color="auto" w:fill="auto"/>
             <w:vAlign w:val="top"/>
           </w:tcPr>
           <w:p>
@@ -14406,7 +14393,7 @@
             <w:tcBorders>
               <w:right w:val="single" w:color="auto" w:sz="12" w:space="0"/>
             </w:tcBorders>
-            <w:shd w:val="clear"/>
+            <w:shd w:val="clear" w:color="auto" w:fill="auto"/>
             <w:vAlign w:val="top"/>
           </w:tcPr>
           <w:p>
@@ -14496,7 +14483,7 @@
               <w:bottom w:val="single" w:color="auto" w:sz="2" w:space="0"/>
               <w:right w:val="single" w:color="auto" w:sz="2" w:space="0"/>
             </w:tcBorders>
-            <w:shd w:val="clear"/>
+            <w:shd w:val="clear" w:color="auto" w:fill="auto"/>
             <w:vAlign w:val="top"/>
           </w:tcPr>
           <w:p>
@@ -14529,7 +14516,7 @@
               <w:bottom w:val="single" w:color="auto" w:sz="2" w:space="0"/>
               <w:right w:val="single" w:color="auto" w:sz="2" w:space="0"/>
             </w:tcBorders>
-            <w:shd w:val="clear"/>
+            <w:shd w:val="clear" w:color="auto" w:fill="auto"/>
             <w:vAlign w:val="top"/>
           </w:tcPr>
           <w:p>
@@ -14605,7 +14592,7 @@
             <w:tcBorders>
               <w:left w:val="single" w:color="auto" w:sz="12" w:space="0"/>
             </w:tcBorders>
-            <w:shd w:val="clear"/>
+            <w:shd w:val="clear" w:color="auto" w:fill="auto"/>
             <w:vAlign w:val="top"/>
           </w:tcPr>
           <w:p>
@@ -14634,7 +14621,7 @@
             <w:tcBorders>
               <w:right w:val="single" w:color="auto" w:sz="12" w:space="0"/>
             </w:tcBorders>
-            <w:shd w:val="clear"/>
+            <w:shd w:val="clear" w:color="auto" w:fill="auto"/>
             <w:vAlign w:val="top"/>
           </w:tcPr>
           <w:p>
@@ -14724,7 +14711,7 @@
               <w:bottom w:val="single" w:color="auto" w:sz="2" w:space="0"/>
               <w:right w:val="single" w:color="auto" w:sz="2" w:space="0"/>
             </w:tcBorders>
-            <w:shd w:val="clear"/>
+            <w:shd w:val="clear" w:color="auto" w:fill="auto"/>
             <w:vAlign w:val="top"/>
           </w:tcPr>
           <w:p>
@@ -14757,7 +14744,7 @@
               <w:bottom w:val="single" w:color="auto" w:sz="2" w:space="0"/>
               <w:right w:val="single" w:color="auto" w:sz="2" w:space="0"/>
             </w:tcBorders>
-            <w:shd w:val="clear"/>
+            <w:shd w:val="clear" w:color="auto" w:fill="auto"/>
             <w:vAlign w:val="top"/>
           </w:tcPr>
           <w:p>
@@ -14833,7 +14820,7 @@
             <w:tcBorders>
               <w:left w:val="single" w:color="auto" w:sz="12" w:space="0"/>
             </w:tcBorders>
-            <w:shd w:val="clear"/>
+            <w:shd w:val="clear" w:color="auto" w:fill="auto"/>
             <w:vAlign w:val="top"/>
           </w:tcPr>
           <w:p>
@@ -14862,7 +14849,7 @@
             <w:tcBorders>
               <w:right w:val="single" w:color="auto" w:sz="12" w:space="0"/>
             </w:tcBorders>
-            <w:shd w:val="clear"/>
+            <w:shd w:val="clear" w:color="auto" w:fill="auto"/>
             <w:vAlign w:val="top"/>
           </w:tcPr>
           <w:p>
@@ -14952,7 +14939,7 @@
               <w:bottom w:val="single" w:color="auto" w:sz="2" w:space="0"/>
               <w:right w:val="single" w:color="auto" w:sz="2" w:space="0"/>
             </w:tcBorders>
-            <w:shd w:val="clear"/>
+            <w:shd w:val="clear" w:color="auto" w:fill="auto"/>
             <w:vAlign w:val="top"/>
           </w:tcPr>
           <w:p>
@@ -14985,7 +14972,7 @@
               <w:bottom w:val="single" w:color="auto" w:sz="2" w:space="0"/>
               <w:right w:val="single" w:color="auto" w:sz="2" w:space="0"/>
             </w:tcBorders>
-            <w:shd w:val="clear"/>
+            <w:shd w:val="clear" w:color="auto" w:fill="auto"/>
             <w:vAlign w:val="top"/>
           </w:tcPr>
           <w:p>
@@ -15061,7 +15048,7 @@
             <w:tcBorders>
               <w:left w:val="single" w:color="auto" w:sz="12" w:space="0"/>
             </w:tcBorders>
-            <w:shd w:val="clear"/>
+            <w:shd w:val="clear" w:color="auto" w:fill="auto"/>
             <w:vAlign w:val="top"/>
           </w:tcPr>
           <w:p>
@@ -15090,7 +15077,7 @@
             <w:tcBorders>
               <w:right w:val="single" w:color="auto" w:sz="12" w:space="0"/>
             </w:tcBorders>
-            <w:shd w:val="clear"/>
+            <w:shd w:val="clear" w:color="auto" w:fill="auto"/>
             <w:vAlign w:val="top"/>
           </w:tcPr>
           <w:p>
@@ -15180,7 +15167,7 @@
               <w:bottom w:val="single" w:color="auto" w:sz="2" w:space="0"/>
               <w:right w:val="single" w:color="auto" w:sz="2" w:space="0"/>
             </w:tcBorders>
-            <w:shd w:val="clear"/>
+            <w:shd w:val="clear" w:color="auto" w:fill="auto"/>
             <w:vAlign w:val="top"/>
           </w:tcPr>
           <w:p>
@@ -15213,7 +15200,7 @@
               <w:bottom w:val="single" w:color="auto" w:sz="2" w:space="0"/>
               <w:right w:val="single" w:color="auto" w:sz="2" w:space="0"/>
             </w:tcBorders>
-            <w:shd w:val="clear"/>
+            <w:shd w:val="clear" w:color="auto" w:fill="auto"/>
             <w:vAlign w:val="top"/>
           </w:tcPr>
           <w:p>
@@ -15289,7 +15276,7 @@
             <w:tcBorders>
               <w:left w:val="single" w:color="auto" w:sz="12" w:space="0"/>
             </w:tcBorders>
-            <w:shd w:val="clear"/>
+            <w:shd w:val="clear" w:color="auto" w:fill="auto"/>
             <w:vAlign w:val="top"/>
           </w:tcPr>
           <w:p>
@@ -15318,7 +15305,7 @@
             <w:tcBorders>
               <w:right w:val="single" w:color="auto" w:sz="12" w:space="0"/>
             </w:tcBorders>
-            <w:shd w:val="clear"/>
+            <w:shd w:val="clear" w:color="auto" w:fill="auto"/>
             <w:vAlign w:val="top"/>
           </w:tcPr>
           <w:p>
@@ -15408,7 +15395,7 @@
               <w:bottom w:val="single" w:color="auto" w:sz="2" w:space="0"/>
               <w:right w:val="single" w:color="auto" w:sz="2" w:space="0"/>
             </w:tcBorders>
-            <w:shd w:val="clear"/>
+            <w:shd w:val="clear" w:color="auto" w:fill="auto"/>
             <w:vAlign w:val="top"/>
           </w:tcPr>
           <w:p>
@@ -15441,7 +15428,7 @@
               <w:bottom w:val="single" w:color="auto" w:sz="2" w:space="0"/>
               <w:right w:val="single" w:color="auto" w:sz="2" w:space="0"/>
             </w:tcBorders>
-            <w:shd w:val="clear"/>
+            <w:shd w:val="clear" w:color="auto" w:fill="auto"/>
             <w:vAlign w:val="top"/>
           </w:tcPr>
           <w:p>
@@ -15517,7 +15504,7 @@
             <w:tcBorders>
               <w:left w:val="single" w:color="auto" w:sz="12" w:space="0"/>
             </w:tcBorders>
-            <w:shd w:val="clear"/>
+            <w:shd w:val="clear" w:color="auto" w:fill="auto"/>
             <w:vAlign w:val="top"/>
           </w:tcPr>
           <w:p>
@@ -15546,7 +15533,7 @@
             <w:tcBorders>
               <w:right w:val="single" w:color="auto" w:sz="12" w:space="0"/>
             </w:tcBorders>
-            <w:shd w:val="clear"/>
+            <w:shd w:val="clear" w:color="auto" w:fill="auto"/>
             <w:vAlign w:val="top"/>
           </w:tcPr>
           <w:p>
@@ -15636,7 +15623,7 @@
               <w:bottom w:val="single" w:color="auto" w:sz="2" w:space="0"/>
               <w:right w:val="single" w:color="auto" w:sz="2" w:space="0"/>
             </w:tcBorders>
-            <w:shd w:val="clear"/>
+            <w:shd w:val="clear" w:color="auto" w:fill="auto"/>
             <w:vAlign w:val="top"/>
           </w:tcPr>
           <w:p>
@@ -15669,7 +15656,7 @@
               <w:bottom w:val="single" w:color="auto" w:sz="2" w:space="0"/>
               <w:right w:val="single" w:color="auto" w:sz="2" w:space="0"/>
             </w:tcBorders>
-            <w:shd w:val="clear"/>
+            <w:shd w:val="clear" w:color="auto" w:fill="auto"/>
             <w:vAlign w:val="top"/>
           </w:tcPr>
           <w:p>
@@ -15745,7 +15732,7 @@
             <w:tcBorders>
               <w:left w:val="single" w:color="auto" w:sz="12" w:space="0"/>
             </w:tcBorders>
-            <w:shd w:val="clear"/>
+            <w:shd w:val="clear" w:color="auto" w:fill="auto"/>
             <w:vAlign w:val="top"/>
           </w:tcPr>
           <w:p>
@@ -15774,7 +15761,7 @@
             <w:tcBorders>
               <w:right w:val="single" w:color="auto" w:sz="12" w:space="0"/>
             </w:tcBorders>
-            <w:shd w:val="clear"/>
+            <w:shd w:val="clear" w:color="auto" w:fill="auto"/>
             <w:vAlign w:val="top"/>
           </w:tcPr>
           <w:p>
@@ -15864,7 +15851,7 @@
               <w:bottom w:val="single" w:color="auto" w:sz="2" w:space="0"/>
               <w:right w:val="single" w:color="auto" w:sz="2" w:space="0"/>
             </w:tcBorders>
-            <w:shd w:val="clear"/>
+            <w:shd w:val="clear" w:color="auto" w:fill="auto"/>
             <w:vAlign w:val="top"/>
           </w:tcPr>
           <w:p>
@@ -15897,7 +15884,7 @@
               <w:bottom w:val="single" w:color="auto" w:sz="2" w:space="0"/>
               <w:right w:val="single" w:color="auto" w:sz="2" w:space="0"/>
             </w:tcBorders>
-            <w:shd w:val="clear"/>
+            <w:shd w:val="clear" w:color="auto" w:fill="auto"/>
             <w:vAlign w:val="top"/>
           </w:tcPr>
           <w:p>
@@ -15976,7 +15963,7 @@
               <w:bottom w:val="single" w:color="auto" w:sz="2" w:space="0"/>
               <w:right w:val="single" w:color="auto" w:sz="2" w:space="0"/>
             </w:tcBorders>
-            <w:shd w:val="clear"/>
+            <w:shd w:val="clear" w:color="auto" w:fill="auto"/>
             <w:vAlign w:val="top"/>
           </w:tcPr>
           <w:p>
@@ -16013,7 +16000,7 @@
               <w:bottom w:val="single" w:color="auto" w:sz="2" w:space="0"/>
               <w:right w:val="single" w:color="auto" w:sz="2" w:space="0"/>
             </w:tcBorders>
-            <w:shd w:val="clear"/>
+            <w:shd w:val="clear" w:color="auto" w:fill="auto"/>
             <w:vAlign w:val="top"/>
           </w:tcPr>
           <w:p>
@@ -16199,12 +16186,6 @@
             <w:insideH w:val="single" w:color="auto" w:sz="4" w:space="0"/>
             <w:insideV w:val="single" w:color="auto" w:sz="4" w:space="0"/>
           </w:tblBorders>
-          <w:tblCellMar>
-            <w:top w:w="0" w:type="dxa"/>
-            <w:left w:w="108" w:type="dxa"/>
-            <w:bottom w:w="0" w:type="dxa"/>
-            <w:right w:w="108" w:type="dxa"/>
-          </w:tblCellMar>
         </w:tblPrEx>
         <w:tc>
           <w:tcPr>

</xml_diff>